<commit_message>
Rebuild CV and homepage from data/cv.json
</commit_message>
<xml_diff>
--- a/cv/cv-kabir-singh-resume-10-30-2026.docx
+++ b/cv/cv-kabir-singh-resume-10-30-2026.docx
@@ -3479,16 +3479,31 @@
     </w:p>
     <w:p>
       <w:pPr>
-        <w:tabs>
-          <w:tab w:val="right" w:pos="9866"/>
-        </w:tabs>
-        <w:spacing w:before="0" w:after="0"/>
-      </w:pPr>
-      <w:r>
-        <w:tab/>
-      </w:r>
-      <w:r>
-        <w:t xml:space="preserve">Sep 2025 – Dec 2025</w:t>
+        <w:keepNext/>
+        <w:tabs>
+          <w:tab w:val="right" w:pos="9866"/>
+        </w:tabs>
+        <w:spacing w:before="0" w:after="0"/>
+      </w:pPr>
+      <w:r>
+        <w:tab/>
+      </w:r>
+      <w:r>
+        <w:t xml:space="preserve">Sep 2025 – Dec 2025,</w:t>
+      </w:r>
+    </w:p>
+    <w:p>
+      <w:pPr>
+        <w:tabs>
+          <w:tab w:val="right" w:pos="9866"/>
+        </w:tabs>
+        <w:spacing w:before="0" w:after="0"/>
+      </w:pPr>
+      <w:r>
+        <w:tab/>
+      </w:r>
+      <w:r>
+        <w:t xml:space="preserve">Sep 2026 – Dec 2026</w:t>
       </w:r>
     </w:p>
     <w:p>

</xml_diff>